<commit_message>
add 200 new daily english sentences
</commit_message>
<xml_diff>
--- a/Speaking.docx
+++ b/Speaking.docx
@@ -368,6 +368,64 @@
           <w:lang w:val="en-US"/>
         </w:rPr>
         <w:t>It is highly likely that …</w:t>
+      </w:r>
+    </w:p>
+    <w:p>
+      <w:pPr>
+        <w:numPr>
+          <w:ilvl w:val="0"/>
+          <w:numId w:val="1"/>
+        </w:numPr>
+        <w:ind w:left="0" w:leftChars="0" w:firstLine="0" w:firstLineChars="0"/>
+        <w:rPr>
+          <w:rFonts w:hint="default"/>
+          <w:lang w:val="en-US"/>
+        </w:rPr>
+      </w:pPr>
+      <w:r>
+        <w:rPr>
+          <w:rFonts w:hint="default"/>
+          <w:lang w:val="en-US"/>
+        </w:rPr>
+        <w:t xml:space="preserve"> Subject + just + past-tense verb</w:t>
+      </w:r>
+    </w:p>
+    <w:p>
+      <w:pPr>
+        <w:numPr>
+          <w:numId w:val="0"/>
+        </w:numPr>
+        <w:ind w:leftChars="0" w:firstLine="720" w:firstLineChars="0"/>
+        <w:rPr>
+          <w:rFonts w:hint="default"/>
+          <w:lang w:val="en-US"/>
+        </w:rPr>
+      </w:pPr>
+      <w:r>
+        <w:rPr>
+          <w:rFonts w:hint="default"/>
+          <w:lang w:val="en-US"/>
+        </w:rPr>
+        <w:t>-&gt; I just woke up</w:t>
+      </w:r>
+    </w:p>
+    <w:p>
+      <w:pPr>
+        <w:numPr>
+          <w:numId w:val="0"/>
+        </w:numPr>
+        <w:ind w:leftChars="0" w:firstLine="720" w:firstLineChars="0"/>
+        <w:rPr>
+          <w:rFonts w:hint="default"/>
+          <w:lang w:val="en-US"/>
+        </w:rPr>
+      </w:pPr>
+      <w:r>
+        <w:rPr>
+          <w:rFonts w:hint="default"/>
+          <w:lang w:val="en-US"/>
+        </w:rPr>
+        <w:t>-&gt; I just arrived</w:t>
       </w:r>
     </w:p>
     <w:p>

</xml_diff>